<commit_message>
docs: add LinkedIn URL and fix SentinelOne end date in resume files
- Add linkedin.com/in/peter-simmons-3439a5 to contact header in both ATS and source DOCX
- Fix SentinelOne end date: 'Present' → 'August 2025' in source DOCX

Co-Authored-By: Claude Sonnet 4.6 <noreply@anthropic.com>
</commit_message>
<xml_diff>
--- a/Documents/Resume/Resume - Peter Simmons.docx
+++ b/Documents/Resume/Resume - Peter Simmons.docx
@@ -1,6 +1,6 @@
 
 <file path=word/document.xml><?xml version="1.0" encoding="utf-8"?>
-<w:document xmlns:wpc="http://schemas.microsoft.com/office/word/2010/wordprocessingCanvas" xmlns:mc="http://schemas.openxmlformats.org/markup-compatibility/2006" xmlns:o="urn:schemas-microsoft-com:office:office" xmlns:r="http://schemas.openxmlformats.org/officeDocument/2006/relationships" xmlns:m="http://schemas.openxmlformats.org/officeDocument/2006/math" xmlns:v="urn:schemas-microsoft-com:vml" xmlns:wp="http://schemas.openxmlformats.org/drawingml/2006/wordprocessingDrawing" xmlns:w="http://schemas.openxmlformats.org/wordprocessingml/2006/main" xmlns:wpg="http://schemas.microsoft.com/office/word/2010/wordprocessingGroup" xmlns:wpi="http://schemas.microsoft.com/office/word/2010/wordprocessingInk" xmlns:a="http://schemas.openxmlformats.org/drawingml/2006/main" xmlns:wne="http://schemas.microsoft.com/office/word/2006/wordml" xmlns:wps="http://schemas.microsoft.com/office/word/2010/wordprocessingShape" xmlns:w10="urn:schemas-microsoft-com:office:word" xmlns:wp14="http://schemas.microsoft.com/office/word/2010/wordprocessingDrawing" xmlns:w14="http://schemas.microsoft.com/office/word/2010/wordml" xmlns:w15="http://schemas.microsoft.com/office/word/2012/wordml" xmlns:w16cex="http://schemas.microsoft.com/office/word/2018/wordml/cex" xmlns:w16cid="http://schemas.microsoft.com/office/word/2016/wordml/cid" xmlns:w16="http://schemas.microsoft.com/office/word/2018/wordml" xmlns:w16sdtdh="http://schemas.microsoft.com/office/word/2020/wordml/sdtdatahash" xmlns:w16se="http://schemas.microsoft.com/office/word/2015/wordml/symex" mc:Ignorable="w14 w15 w16se w16cid w16 w16cex w16sdtdh wp14">
+<w:document xmlns:wpc="http://schemas.microsoft.com/office/word/2010/wordprocessingCanvas" xmlns:mc="http://schemas.openxmlformats.org/markup-compatibility/2006" xmlns:o="urn:schemas-microsoft-com:office:office" xmlns:r="http://schemas.openxmlformats.org/officeDocument/2006/relationships" xmlns:m="http://schemas.openxmlformats.org/officeDocument/2006/math" xmlns:v="urn:schemas-microsoft-com:vml" xmlns:wp="http://schemas.openxmlformats.org/drawingml/2006/wordprocessingDrawing" xmlns:w="http://schemas.openxmlformats.org/wordprocessingml/2006/main" xmlns:wpg="http://schemas.microsoft.com/office/word/2010/wordprocessingGroup" xmlns:wpi="http://schemas.microsoft.com/office/word/2010/wordprocessingInk" xmlns:a="http://schemas.openxmlformats.org/drawingml/2006/main" xmlns:wne="http://schemas.microsoft.com/office/word/2006/wordml" xmlns:wps="http://schemas.microsoft.com/office/word/2010/wordprocessingShape" xmlns:w10="urn:schemas-microsoft-com:office:word" xmlns:wp14="http://schemas.microsoft.com/office/word/2010/wordprocessingDrawing" xmlns:w14="http://schemas.microsoft.com/office/word/2010/wordml" xmlns:w15="http://schemas.microsoft.com/office/word/2012/wordml" xmlns:w16cex="http://schemas.microsoft.com/office/word/2018/wordml/cex" xmlns:w16cid="http://schemas.microsoft.com/office/word/2016/wordml/cid" xmlns:w16="http://schemas.microsoft.com/office/word/2018/wordml" xmlns:w16sdtdh="http://schemas.microsoft.com/office/word/2020/wordml/sdtdatahash" xmlns:w16se="http://schemas.microsoft.com/office/word/2015/wordml/symex">
   <w:body>
     <w:p>
       <w:pPr>
@@ -117,7 +117,7 @@
         <w:sdtContent>
           <w:r/>
           <w:r>
-            <w:t xml:space="preserve">peter.simmons.ga@gmail.com</w:t>
+            <w:t xml:space="preserve">peter.simmons.ga@gmail.com  |  linkedin.com/in/peter-simmons-3439a5</w:t>
           </w:r>
         </w:sdtContent>
       </w:sdt>
@@ -1169,7 +1169,7 @@
                 <w:szCs w:val="20"/>
                 <w:lang w:val="en-US" w:eastAsia="ja-JP" w:bidi="ar-SA"/>
               </w:rPr>
-              <w:t xml:space="preserve">November 2021 - Present</w:t>
+              <w:t xml:space="preserve">November 2021 - August 2025</w:t>
             </w:r>
             <w:r>
               <w:rPr>

</xml_diff>